<commit_message>
Ders kitabı: inceleme düzeltmeleri, kesme sayfası ve test düzeni
- Teknik ve dil incelemesindeki bulgular düzeltildi (ASCII/UTF-8 anlatımı,
  etkinlik yönergeleri, cevap anahtarı, şık sıraları, öğretmen notları)
- Kitabın sonuna kesilebilir büyük bit kartları sayfası eklendi
- Çoktan seçmeli soruların şıkları sayfa sonunda bölünmüyor

Co-Authored-By: Claude Opus 5.5 <noreply@anthropic.com>
Claude-Session: https://claude.ai/code/session_01WSoic3YdwcHhA17UJHt3Dv
</commit_message>
<xml_diff>
--- a/video/kitap/kapi1-kisim1/Birinci-Kapi-1-Var-ve-Yok-Ders-Kitabi.docx
+++ b/video/kitap/kapi1-kisim1/Birinci-Kapi-1-Var-ve-Yok-Ders-Kitabi.docx
@@ -790,7 +790,7 @@
         <w:jc w:val="both"/>
       </w:pPr>
       <w:r>
-        <w:t xml:space="preserve">Kurşun kalem ve silgi, renkli kalemler (kırmızı, turuncu, sarı, kahverengi), makas, bir el feneri ya da telefon feneri, birkaç yaprak beyaz kâğıt. Hesap makinesi bazı etkinliklerde işinizi kolaylaştırır.</w:t>
+        <w:t xml:space="preserve">Kurşun kalem ve silgi, renkli kalemler (kırmızı, turuncu, sarı, kahverengi, yeşil, mavi, pembe ya da mor, açık mavi, gri), makas, bir el feneri ya da telefon feneri, en az 8 yaprak beyaz kâğıt, süre tutmak için saat ya da telefon kronometresi. Hesap makinesi bazı etkinliklerde işinizi kolaylaştırır.</w:t>
       </w:r>
     </w:p>
     <w:p>
@@ -805,7 +805,7 @@
         <w:spacing w:after="80" w:before="160"/>
       </w:pPr>
       <w:r>
-        <w:t xml:space="preserve">Bu bölümün sonunda…</w:t>
+        <w:t xml:space="preserve">Bu kısmın sonunda…</w:t>
       </w:r>
     </w:p>
     <w:p>
@@ -2266,7 +2266,7 @@
                 <w:sz w:val="22"/>
                 <w:szCs w:val="22"/>
               </w:rPr>
-              <w:t xml:space="preserve">Bölüm Özeti ve Kavram Sözlüğü</w:t>
+              <w:t xml:space="preserve">Kısım Özeti ve Kavram Sözlüğü</w:t>
             </w:r>
           </w:p>
         </w:tc>
@@ -2352,7 +2352,7 @@
                 <w:sz w:val="22"/>
                 <w:szCs w:val="22"/>
               </w:rPr>
-              <w:t xml:space="preserve">Kendini Değerlendir</w:t>
+              <w:t xml:space="preserve">Kendinizi Değerlendirin</w:t>
             </w:r>
           </w:p>
         </w:tc>
@@ -2439,7 +2439,7 @@
                 <w:sz w:val="22"/>
                 <w:szCs w:val="22"/>
               </w:rPr>
-              <w:t xml:space="preserve">Proje: Kendi Kodlamanı Yarat</w:t>
+              <w:t xml:space="preserve">Proje: Kendi Kodlamanızı Yaratın</w:t>
             </w:r>
           </w:p>
         </w:tc>
@@ -2525,7 +2525,7 @@
                 <w:sz w:val="22"/>
                 <w:szCs w:val="22"/>
               </w:rPr>
-              <w:t xml:space="preserve">Cevap Anahtarı ve Öğretmene Notlar</w:t>
+              <w:t xml:space="preserve">Cevap Anahtarı, Öğretmene Notlar ve Kesme Sayfası</w:t>
             </w:r>
           </w:p>
         </w:tc>
@@ -2953,7 +2953,7 @@
               <w:t xml:space="preserve">Kod</w:t>
             </w:r>
             <w:r>
-              <w:t xml:space="preserve">, önceden üzerinde anlaşılmış anlamdır. İşaretin (ateş, ışık, elektrik…) kendisi bir şey söylemez; ona anlamı, gönderen ile alanın ortak anlaşması verir.</w:t>
+              <w:t xml:space="preserve">, işaretlerle anlamları eşleştiren, önceden yapılmış anlaşmadır. İşaretin (ateş, ışık, elektrik…) kendisi bir şey söylemez; ona anlamı, gönderen ile alanın ortak anlaşması verir.</w:t>
             </w:r>
           </w:p>
         </w:tc>
@@ -3132,7 +3132,7 @@
               <w:jc w:val="both"/>
             </w:pPr>
             <w:r>
-              <w:t xml:space="preserve">a) Haber 1. tepeden 6. tepeye ateş zinciriyle kaç dakikada ulaşır?</w:t>
+              <w:t xml:space="preserve">a) 1. tepedeki ateş yandıktan kaç dakika sonra 6. tepedeki ateş de yanar?</w:t>
             </w:r>
           </w:p>
           <w:p>
@@ -3281,7 +3281,7 @@
               <w:jc w:val="both"/>
             </w:pPr>
             <w:r>
-              <w:t xml:space="preserve">1. Öğretmen ilk öğrenciye yalnızca “tehlike var” bilgisini verir (elini kaldırır). Son öğrencinin elini kaldırması kaç saniye sürdü? Ölçün.</w:t>
+              <w:t xml:space="preserve">1. Bir öğrenci telefon kronometresiyle süre tutar. Öğretmen elini kaldırarak ilk öğrenciye yalnızca “tehlike var” işaretini verir; her öğrenci önündekinin elinin kalktığını görünce kendi elini kaldırır. Öğretmenin işaretinden son öğrencinin elini kaldırmasına kadar kaç saniye geçti?</w:t>
             </w:r>
           </w:p>
           <w:p>
@@ -3290,7 +3290,7 @@
               <w:jc w:val="both"/>
             </w:pPr>
             <w:r>
-              <w:t xml:space="preserve">2. Şimdi aynı zinciri fısıltıyla deneyin: İlk öğrenciye “Kuzeyden kırk iki atlı ve üç araba geliyor” cümlesi fısıldansın; herkes duyduğunu arkadaşına fısıldasın.</w:t>
+              <w:t xml:space="preserve">2. Şimdi aynı zinciri fısıltıyla deneyin: İlk öğrenciye “Kuzeyden kırk iki atlı ve üç araba geliyor” cümlesi fısıldansın; herkes duyduğunu arkadaşına fısıldasın. Süreyi yine ölçün; son öğrenci duyduğu cümleyi yüksek sesle söylesin ve ilk cümleyle karşılaştırın.</w:t>
             </w:r>
           </w:p>
           <w:p>
@@ -3628,7 +3628,7 @@
         <w:t xml:space="preserve">Ateş yanıyor mu, yanmıyor mu?</w:t>
       </w:r>
       <w:r>
-        <w:t xml:space="preserve"> Sis ne kadar yoğun olursa olsun, nöbetçi bunu görür.</w:t>
+        <w:t xml:space="preserve"> Sis ateşi soluklaştırsa bile nöbetçi bunu çoğu zaman görebilir; çünkü artık ince bir fark aramıyor, yalnızca ışık var mı yok mu ona bakıyor.</w:t>
       </w:r>
     </w:p>
     <w:p>
@@ -3841,7 +3841,7 @@
               <w:jc w:val="both"/>
             </w:pPr>
             <w:r>
-              <w:t xml:space="preserve">1. Gönderen, gözlemcinin göremeyeceği biçimde fenerin önüne 0, 1, 2, 3 ya da 4 yaprak kâğıt koyar. Böylece 5 farklı parlaklık elde edilir.</w:t>
+              <w:t xml:space="preserve">1. Fenerin önüne 0, 1, 2, 3 ya da 4 yaprak kâğıt koyarak 5 farklı parlaklık elde edilir. Önce gözlemciye bu beş parlaklığı sırayla bir kez gösterin. Sonra gözlemci arkasını döner; gönderen 0–4 arasından rastgele bir sayı seçer, not eder ve o kadar yaprağı fenerin önüne koyar. (Feneri doğrudan göze tutmayın.)</w:t>
             </w:r>
           </w:p>
           <w:p>
@@ -3850,7 +3850,7 @@
               <w:jc w:val="both"/>
             </w:pPr>
             <w:r>
-              <w:t xml:space="preserve">2. Gözlemci 3 metre uzaktan ışığa bakar ve kaç yaprak kâğıt olduğunu tahmin eder. 10 deneme yapın; doğru tahminleri sayın.</w:t>
+              <w:t xml:space="preserve">2. Gözlemci dönüp 3 metre uzaktan ışığa bakar ve kaç yaprak kâğıt olduğunu tahmin eder. 10 deneme yapın; doğru tahminleri sayın.</w:t>
             </w:r>
           </w:p>
           <w:p>
@@ -4638,7 +4638,7 @@
         <w:t xml:space="preserve">volt</w:t>
       </w:r>
       <w:r>
-        <w:t xml:space="preserve"> denen birimle ölçeriz. Telefon şarj aletinin çıkışı 5 volttur; bir kalem pil 1,5 volt.</w:t>
+        <w:t xml:space="preserve"> denen birimle ölçeriz. Klasik bir telefon şarj aletinin çıkışı 5 volttur; bir kalem pil 1,5 volt.</w:t>
       </w:r>
     </w:p>
     <w:p>
@@ -6978,17 +6978,27 @@
               <w:jc w:val="both"/>
             </w:pPr>
             <w:r>
-              <w:t xml:space="preserve">Tabloyu doldurun. Son iki satırda önce </w:t>
+              <w:t xml:space="preserve">Soldaki tabloda katlamayı sürdürün. Sağdaki tabloda önce </w:t>
             </w:r>
             <w:r>
               <w:rPr>
                 <w:b/>
                 <w:bCs/>
               </w:rPr>
-              <w:t xml:space="preserve">tahmin</w:t>
-            </w:r>
-            <w:r>
-              <w:t xml:space="preserve"> edin, sonra hesap makinesiyle hesaplayın.</w:t>
+              <w:t xml:space="preserve">Tahminim</w:t>
+            </w:r>
+            <w:r>
+              <w:t xml:space="preserve"> sütununa tahmininizi yazın, sonra </w:t>
+            </w:r>
+            <w:r>
+              <w:rPr>
+                <w:b/>
+                <w:bCs/>
+              </w:rPr>
+              <w:t xml:space="preserve">Hesap</w:t>
+            </w:r>
+            <w:r>
+              <w:t xml:space="preserve"> sütununa hesap makinesiyle bulduğunuz değeri yazın. Sağdaki iki boş satıra kendi seçtiğiniz lamba sayılarını yazın.</w:t>
             </w:r>
           </w:p>
           <w:tbl>
@@ -9625,20 +9635,20 @@
           <w:b/>
           <w:bCs/>
         </w:rPr>
-        <w:t xml:space="preserve">onar onar</w:t>
-      </w:r>
-      <w:r>
-        <w:t xml:space="preserve"> büyür; ikilik sistemde 1, 2, 4, 8 diye </w:t>
+        <w:t xml:space="preserve">her adımda on katına</w:t>
+      </w:r>
+      <w:r>
+        <w:t xml:space="preserve"> çıkar; ikilik sistemde 1, 2, 4, 8 diye </w:t>
       </w:r>
       <w:r>
         <w:rPr>
           <w:b/>
           <w:bCs/>
         </w:rPr>
-        <w:t xml:space="preserve">ikişer ikişer</w:t>
-      </w:r>
-      <w:r>
-        <w:t xml:space="preserve"> büyür. Onluk sistemde her basamakta on rakam (0–9), ikilik sistemde yalnızca iki rakam (0 ve 1) vardır.</w:t>
+        <w:t xml:space="preserve">her adımda iki katına</w:t>
+      </w:r>
+      <w:r>
+        <w:t xml:space="preserve"> çıkar. Onluk sistemde her basamakta on rakam (0–9), ikilik sistemde yalnızca iki rakam (0 ve 1) vardır.</w:t>
       </w:r>
     </w:p>
     <w:p>
@@ -9657,7 +9667,7 @@
         <w:jc w:val="both"/>
       </w:pPr>
       <w:r>
-        <w:t xml:space="preserve">En büyük değerden başlayın. Sayı o değere </w:t>
+        <w:t xml:space="preserve">En büyük değerden başlayın. O değer elinizdeki sayıya (sonraki adımlarda kalana) </w:t>
       </w:r>
       <w:r>
         <w:rPr>
@@ -9667,7 +9677,7 @@
         <w:t xml:space="preserve">sığıyorsa</w:t>
       </w:r>
       <w:r>
-        <w:t xml:space="preserve"> lambayı yakın (1) ve değeri sayıdan çıkarın; sığmıyorsa sönük bırakın (0). Örnek: </w:t>
+        <w:t xml:space="preserve">, yani ondan büyük değilse, lambayı yakın (1) ve değeri çıkarın; sığmıyorsa sönük bırakın (0). Örnek: </w:t>
       </w:r>
       <w:r>
         <w:rPr>
@@ -10451,7 +10461,7 @@
               <w:t xml:space="preserve">31</w:t>
             </w:r>
             <w:r>
-              <w:t xml:space="preserve">’e, iki elle 0’dan </w:t>
+              <w:t xml:space="preserve">’e kadar sayabilirsiniz. Öteki elin parmaklarına da 32, 64, 128, 256, 512 değerlerini verirseniz iki elle 0’dan </w:t>
             </w:r>
             <w:r>
               <w:rPr>
@@ -10541,7 +10551,17 @@
               <w:jc w:val="both"/>
             </w:pPr>
             <w:r>
-              <w:t xml:space="preserve">Aşağıdaki beş kartı kesin ve masaya </w:t>
+              <w:t xml:space="preserve">Kitabın son sayfasındaki </w:t>
+            </w:r>
+            <w:r>
+              <w:rPr>
+                <w:b/>
+                <w:bCs/>
+              </w:rPr>
+              <w:t xml:space="preserve">kesme sayfasından</w:t>
+            </w:r>
+            <w:r>
+              <w:t xml:space="preserve"> beş kartı kesin (ya da kartları bir kâğıda çizin) ve masaya </w:t>
             </w:r>
             <w:r>
               <w:rPr>
@@ -10761,6 +10781,15 @@
                 <w:szCs w:val="21"/>
               </w:rPr>
               <w:t xml:space="preserve">  ·  8. Çeviri Alıştırması</w:t>
+            </w:r>
+          </w:p>
+          <w:p>
+            <w:pPr>
+              <w:spacing w:after="100" w:before="0" w:line="300"/>
+              <w:jc w:val="both"/>
+            </w:pPr>
+            <w:r>
+              <w:t xml:space="preserve">İkilik sayıları onluğa, onluk sayıları sekiz bitlik ikilik sayılara çevirin. Onluktan ikiliğe çevirirken yukarıdaki “sığıyor mu?” yöntemini kullanın.</w:t>
             </w:r>
           </w:p>
           <w:tbl>
@@ -12743,7 +12772,7 @@
                 <w:sz w:val="20"/>
                 <w:szCs w:val="20"/>
               </w:rPr>
-              <w:t xml:space="preserve">Küçük bir kütüphanenin bütün kitapları</w:t>
+              <w:t xml:space="preserve">Yüzlerce film ya da yaklaşık bir milyon kitabın metni</w:t>
             </w:r>
           </w:p>
         </w:tc>
@@ -12935,7 +12964,7 @@
               <w:t xml:space="preserve">931 GB</w:t>
             </w:r>
             <w:r>
-              <w:t xml:space="preserve"> görünmesinin nedeni budur: Üretici 1.000’lerle, işletim sistemi 1.024’lerle sayar.</w:t>
+              <w:t xml:space="preserve"> görünmesinin nedeni budur: Üretici 1.000’lerle, bazı işletim sistemleri (örneğin Windows) ise 1.024’lerle sayar.</w:t>
             </w:r>
           </w:p>
         </w:tc>
@@ -13317,7 +13346,7 @@
         <w:t xml:space="preserve">karakter kodlaması</w:t>
       </w:r>
       <w:r>
-        <w:t xml:space="preserve"> denir. En eski ve en yaygın olanı, 1963’te hazırlanan </w:t>
+        <w:t xml:space="preserve"> denir. Bilgisayarlarda yaygınlaşan ilk standart, 1963’te hazırlanan </w:t>
       </w:r>
       <w:r>
         <w:rPr>
@@ -13327,7 +13356,7 @@
         <w:t xml:space="preserve">ASCII</w:t>
       </w:r>
       <w:r>
-        <w:t xml:space="preserve">’dir (Amerikan Standart Bilgi Değişim Kodu).</w:t>
+        <w:t xml:space="preserve">’dir (Amerikan Standart Bilgi Değişim Kodu); küçük harfler 1967’de eklendi.</w:t>
       </w:r>
     </w:p>
     <w:tbl>
@@ -15380,27 +15409,47 @@
               <w:jc w:val="both"/>
             </w:pPr>
             <w:r>
-              <w:t xml:space="preserve">“7 rakamı bilgisayarda 7 olarak saklanır.” Metin içindeki </w:t>
+              <w:t xml:space="preserve">“Klavyeden yazdığım 7, bilgisayarda 7 sayısı olarak saklanır.” </w:t>
             </w:r>
             <w:r>
               <w:rPr>
                 <w:b/>
                 <w:bCs/>
               </w:rPr>
+              <w:t xml:space="preserve">Hayır!</w:t>
+            </w:r>
+            <w:r>
+              <w:t xml:space="preserve"> Metin içindeki </w:t>
+            </w:r>
+            <w:r>
+              <w:rPr>
+                <w:b/>
+                <w:bCs/>
+              </w:rPr>
               <w:t xml:space="preserve">“7” karakterinin kodu 55’tir</w:t>
             </w:r>
             <w:r>
-              <w:t xml:space="preserve">; hesap yapılan 7 sayısı ise </w:t>
+              <w:t xml:space="preserve"> (</w:t>
             </w:r>
             <w:r>
               <w:rPr>
                 <w:rFonts w:ascii="Consolas" w:cs="Consolas" w:eastAsia="Consolas" w:hAnsi="Consolas"/>
                 <w:color w:val="1B2338"/>
               </w:rPr>
+              <w:t xml:space="preserve">00110111</w:t>
+            </w:r>
+            <w:r>
+              <w:t xml:space="preserve">); hesap yapılan 7 sayısı ise </w:t>
+            </w:r>
+            <w:r>
+              <w:rPr>
+                <w:rFonts w:ascii="Consolas" w:cs="Consolas" w:eastAsia="Consolas" w:hAnsi="Consolas"/>
+                <w:color w:val="1B2338"/>
+              </w:rPr>
               <w:t xml:space="preserve">00000111</w:t>
             </w:r>
             <w:r>
-              <w:t xml:space="preserve"> olarak saklanır. Bir telefon numarası ya da posta kodu, çoğu zaman sayı değil, karakter dizisi olarak tutulur.</w:t>
+              <w:t xml:space="preserve"> olarak saklanır. İkisi bambaşka bit dizileridir. Bir telefon numarası ya da posta kodu, çoğu zaman sayı değil, karakter dizisi olarak tutulur.</w:t>
             </w:r>
           </w:p>
         </w:tc>
@@ -16288,7 +16337,7 @@
               <w:jc w:val="both"/>
             </w:pPr>
             <w:r>
-              <w:t xml:space="preserve">Adınızda Ç, Ğ, İ, Ö, Ş ya da Ü varsa ne oldu? Not edin.</w:t>
+              <w:t xml:space="preserve">Adınızda Ç, Ğ, İ, Ö, Ş ya da Ü varsa bu harflerin kodunu tabloda bulabildiniz mi? Bulamadıysanız ne yaptınız? Not edin.</w:t>
             </w:r>
           </w:p>
           <w:p>
@@ -16375,7 +16424,7 @@
           <w:sz w:val="18"/>
           <w:szCs w:val="18"/>
         </w:rPr>
-        <w:t xml:space="preserve">   Ç, Ğ, I, İ, Ö, Ş, Ü nereye sığdı?  </w:t>
+        <w:t xml:space="preserve">   ç, ğ, ı, İ, ö, ş, ü nereye sığdı?  </w:t>
       </w:r>
     </w:p>
     <w:p>
@@ -16483,10 +16532,40 @@
           <w:b/>
           <w:bCs/>
         </w:rPr>
-        <w:t xml:space="preserve">ç, ğ, ı, İ, ö, ş, ü</w:t>
-      </w:r>
-      <w:r>
-        <w:t xml:space="preserve"> harfleri (ve büyükleri) bu listede yoktu. Her ülke boş kalan yarıya kendi harflerini yerleştirdi; ama herkes </w:t>
+        <w:t xml:space="preserve">ç, ğ, ı, ö, ş, ü</w:t>
+      </w:r>
+      <w:r>
+        <w:t xml:space="preserve"> harfleri, bunların büyükleri </w:t>
+      </w:r>
+      <w:r>
+        <w:rPr>
+          <w:b/>
+          <w:bCs/>
+        </w:rPr>
+        <w:t xml:space="preserve">Ç, Ğ, Ö, Ş, Ü</w:t>
+      </w:r>
+      <w:r>
+        <w:t xml:space="preserve"> ve noktalı büyük </w:t>
+      </w:r>
+      <w:r>
+        <w:rPr>
+          <w:b/>
+          <w:bCs/>
+        </w:rPr>
+        <w:t xml:space="preserve">İ</w:t>
+      </w:r>
+      <w:r>
+        <w:t xml:space="preserve"> bu listede yoktu. (Noktasız büyük </w:t>
+      </w:r>
+      <w:r>
+        <w:rPr>
+          <w:b/>
+          <w:bCs/>
+        </w:rPr>
+        <w:t xml:space="preserve">I</w:t>
+      </w:r>
+      <w:r>
+        <w:t xml:space="preserve"> ise İngilizcedeki I ile aynı olduğu için vardı.) Her ülke boş kalan yarıya kendi harflerini yerleştirdi; ama herkes </w:t>
       </w:r>
       <w:r>
         <w:rPr>
@@ -16545,7 +16624,17 @@
         <w:t xml:space="preserve">sayı</w:t>
       </w:r>
       <w:r>
-        <w:t xml:space="preserve"> çıkar. Karşı taraf başka bir listeye bakıyorsa “ağaç” yazdığınız yerde “aðaç” okur. Bu bozulmaya İngilizcede </w:t>
+        <w:t xml:space="preserve"> çıkar. Karşı taraf başka bir listeye bakıyorsa “ağaç” yazdığınız yerde “aðaç” okur. Bu bozulmaya </w:t>
+      </w:r>
+      <w:r>
+        <w:rPr>
+          <w:b/>
+          <w:bCs/>
+        </w:rPr>
+        <w:t xml:space="preserve">karakter bozulması</w:t>
+      </w:r>
+      <w:r>
+        <w:t xml:space="preserve"> denir; yazılımcılar Japoncadan alınmış </w:t>
       </w:r>
       <w:r>
         <w:rPr>
@@ -16555,7 +16644,7 @@
         <w:t xml:space="preserve">mojibake</w:t>
       </w:r>
       <w:r>
-        <w:t xml:space="preserve"> (Japonca “bozulmuş karakter”) denir.</w:t>
+        <w:t xml:space="preserve"> (“bozulmuş karakter”) sözcüğünü de kullanır.</w:t>
       </w:r>
     </w:p>
     <w:p>
@@ -17516,7 +17605,7 @@
         <w:t xml:space="preserve">287</w:t>
       </w:r>
       <w:r>
-        <w:t xml:space="preserve">. 287, 255’ten büyük olduğu için tek bayta sığmaz; en yaygın Unicode yazım biçimi olan </w:t>
+        <w:t xml:space="preserve">. En yaygın Unicode yazım biçimi olan </w:t>
       </w:r>
       <w:r>
         <w:rPr>
@@ -17526,17 +17615,17 @@
         <w:t xml:space="preserve">UTF-8</w:t>
       </w:r>
       <w:r>
-        <w:t xml:space="preserve">, ğ harfini </w:t>
+        <w:t xml:space="preserve">, ASCII’deki ilk 128 karakteri tek baytla, öteki harfleri iki ya da daha fazla baytla saklar: ğ </w:t>
       </w:r>
       <w:r>
         <w:rPr>
           <w:b/>
           <w:bCs/>
         </w:rPr>
-        <w:t xml:space="preserve">iki baytla</w:t>
-      </w:r>
-      <w:r>
-        <w:t xml:space="preserve"> saklar.</w:t>
+        <w:t xml:space="preserve">iki bayt</w:t>
+      </w:r>
+      <w:r>
+        <w:t xml:space="preserve"> tutar; ç, ö, ü da UTF-8’de iki bayttır.</w:t>
       </w:r>
     </w:p>
     <w:p>
@@ -20611,6 +20700,36 @@
         <w:t xml:space="preserve">D6</w:t>
       </w:r>
       <w:r>
+        <w:t xml:space="preserve">. (Dört bitin değerleri 8, 4, 2, 1’dir.) Tersine çevirmek için her simgeyi dört bite açın, sonra Ünite 5’teki bayt değerleriyle toplayın: </w:t>
+      </w:r>
+      <w:r>
+        <w:rPr>
+          <w:b/>
+          <w:bCs/>
+        </w:rPr>
+        <w:t xml:space="preserve">C8</w:t>
+      </w:r>
+      <w:r>
+        <w:t xml:space="preserve"> → </w:t>
+      </w:r>
+      <w:r>
+        <w:rPr>
+          <w:rFonts w:ascii="Consolas" w:cs="Consolas" w:eastAsia="Consolas" w:hAnsi="Consolas"/>
+          <w:color w:val="1B2338"/>
+        </w:rPr>
+        <w:t xml:space="preserve">1100 1000</w:t>
+      </w:r>
+      <w:r>
+        <w:t xml:space="preserve"> → 128 + 64 + 8 = </w:t>
+      </w:r>
+      <w:r>
+        <w:rPr>
+          <w:b/>
+          <w:bCs/>
+        </w:rPr>
+        <w:t xml:space="preserve">200</w:t>
+      </w:r>
+      <w:r>
         <w:t xml:space="preserve">.</w:t>
       </w:r>
     </w:p>
@@ -21531,7 +21650,7 @@
               <w:jc w:val="both"/>
             </w:pPr>
             <w:r>
-              <w:t xml:space="preserve">Kutulardaki kodların hangi renge karşılık geldiğini bulun; kutuları renkli kalemle boyayın ya da rengin adını altına yazın. İpucu: Kırmızı + yeşil ışık </w:t>
+              <w:t xml:space="preserve">Kutulardaki kodların hangi renge karşılık geldiğini bulun; kutuları renkli kalemle boyayın ya da rengin adını kutunun içine yazın. İpucu: Kırmızı + yeşil ışık </w:t>
             </w:r>
             <w:r>
               <w:rPr>
@@ -21561,7 +21680,7 @@
               <w:t xml:space="preserve">camgöbeği</w:t>
             </w:r>
             <w:r>
-              <w:t xml:space="preserve"> (turkuaz) yapar. Üç ışığın yarısı, gri bir renk verir.</w:t>
+              <w:t xml:space="preserve"> (turkuaz) yapar. Üç ışık da yarı güçte yanarsa (80 ≈ 128) gri görünür. Son kutu bir meydan okuma: Kırmızı tam, yeşil yarıdan biraz fazla (A5 = 165), mavi hiç yoksa ne çıkar?</w:t>
             </w:r>
           </w:p>
           <w:p>
@@ -21734,7 +21853,17 @@
         <w:t xml:space="preserve">36 milyon sayı</w:t>
       </w:r>
       <w:r>
-        <w:t xml:space="preserve"> vardır.</w:t>
+        <w:t xml:space="preserve"> vardır. Bu, olduğu gibi saklansa yaklaşık 36 MB ederdi; telefonlar sayıları akıllıca </w:t>
+      </w:r>
+      <w:r>
+        <w:rPr>
+          <w:b/>
+          <w:bCs/>
+        </w:rPr>
+        <w:t xml:space="preserve">sıkıştırarak</w:t>
+      </w:r>
+      <w:r>
+        <w:t xml:space="preserve"> fotoğrafı birkaç megabayta indirir.</w:t>
       </w:r>
     </w:p>
     <w:p>
@@ -21928,7 +22057,7 @@
         <w:jc w:val="both"/>
       </w:pPr>
       <w:r>
-        <w:t xml:space="preserve">Video, art arda gösterilen fotoğraflardır. Saniyede 25–30 kare gösterilince göz bunları akan bir hareket olarak algılar. Sıcaklık, nem, mesafe, kalp atışı, adım sayısı, konum… </w:t>
+        <w:t xml:space="preserve">Video, art arda gösterilen fotoğraflardan oluşur. Saniyede 25–30 kare gösterilince göz bunları akan bir hareket olarak algılar. Sıcaklık, nem, mesafe, kalp atışı, adım sayısı, konum… </w:t>
       </w:r>
       <w:r>
         <w:rPr>
@@ -22032,7 +22161,7 @@
               <w:jc w:val="both"/>
             </w:pPr>
             <w:r>
-              <w:t xml:space="preserve">Her kare bir pikseldir. Karelerdeki sayılar, renk anahtarındaki renkleri gösterir; sayısız kareler beyaz kalır. Kareleri boyayın.</w:t>
+              <w:t xml:space="preserve">Her kare bir pikseldir. Karelerdeki sayılar, renk anahtarındaki renkleri gösterir; içinde sayı yazmayan kareler beyaz kalır. Kareleri boyayın.</w:t>
             </w:r>
           </w:p>
           <w:p>
@@ -23257,7 +23386,7 @@
               <w:jc w:val="both"/>
             </w:pPr>
             <w:r>
-              <w:t xml:space="preserve">a) En yüksek ve en düşük ölçüm hangi sırada? ……………………</w:t>
+              <w:t xml:space="preserve">a) En yüksek ve en düşük ölçümün sıra numarası kaçtır? (Sıra numaraları 0’dan başlar.) ……………………</w:t>
             </w:r>
           </w:p>
           <w:p>
@@ -24277,7 +24406,7 @@
         <w:jc w:val="both"/>
       </w:pPr>
       <w:r>
-        <w:t xml:space="preserve">Ölçülebilen her şeyin sayıya çevrilebilmesi, bilişim çağının hem bütün gücünün hem de bütün tehlikesinin kaynağıdır. Çünkü bu cümle </w:t>
+        <w:t xml:space="preserve">Ölçülebilen her şeyin sayıya çevrilebilmesi, bilişim çağının hem bütün gücünün hem de bütün tehlikesinin kaynağıdır. Çünkü “ölçülebilen her şey sayıya çevrilebilir” cümlesi </w:t>
       </w:r>
       <w:r>
         <w:rPr>
@@ -24384,6 +24513,15 @@
         <w:t xml:space="preserve">“Ölçmek, güçtür. Ve her güç gibi, kimin elinde olduğu sorusunu doğurur.”</w:t>
       </w:r>
     </w:p>
+    <w:p>
+      <w:pPr>
+        <w:spacing w:after="140" w:before="0" w:line="300"/>
+        <w:jc w:val="both"/>
+      </w:pPr>
+      <w:r>
+        <w:t xml:space="preserve">Buradaki “güç” zorluk anlamında değil; kuvvet, söz sahibi olmak anlamındadır: Ölçen bilir, bilen karar verir.</w:t>
+      </w:r>
+    </w:p>
     <w:tbl>
       <w:tblPr>
         <w:tblW w:type="dxa" w:w="9524"/>
@@ -24543,7 +24681,7 @@
               <w:jc w:val="both"/>
             </w:pPr>
             <w:r>
-              <w:t xml:space="preserve">Dün kullandığınız uygulamaları ve cihazları düşünün. Hangi bilgiler ölçülmüş olabilir? Tabloyu doldurun.</w:t>
+              <w:t xml:space="preserve">Dün kullandığınız uygulamaları ve cihazları düşünün (telefonunuz yoksa evdeki ya da okuldaki cihazları: televizyon, okul kartı, güvenlik kamerası…). Hangi bilgiler ölçülmüş olabilir? Tabloyu doldurun. Paylaşmak istemediğiniz bir bilgiyi yazmak zorunda değilsiniz.</w:t>
             </w:r>
           </w:p>
           <w:tbl>
@@ -25540,7 +25678,7 @@
           <w:sz w:val="22"/>
           <w:szCs w:val="22"/>
         </w:rPr>
-        <w:t xml:space="preserve">BÖLÜM SONU</w:t>
+        <w:t xml:space="preserve">KISIM SONU</w:t>
       </w:r>
     </w:p>
     <w:p>
@@ -25549,7 +25687,7 @@
         <w:spacing w:after="160"/>
       </w:pPr>
       <w:r>
-        <w:t xml:space="preserve">Bu Bölümde Neler Öğrendik?</w:t>
+        <w:t xml:space="preserve">Bu Kısımda Neler Öğrendik?</w:t>
       </w:r>
     </w:p>
     <w:p>
@@ -25605,7 +25743,7 @@
         <w:spacing w:after="80" w:line="290"/>
       </w:pPr>
       <w:r>
-        <w:t xml:space="preserve">Elektrik hiç yerinde durmaz; makine bir </w:t>
+        <w:t xml:space="preserve">Teldeki voltaj hiç yerinde durmaz; makine bir </w:t>
       </w:r>
       <w:r>
         <w:rPr>
@@ -25783,7 +25921,7 @@
         <w:t xml:space="preserve">on altılık</w:t>
       </w:r>
       <w:r>
-        <w:t xml:space="preserve"> simgeyle yazılır (0–9, A–F); web renkleri #RRGGBB biçimindedir.</w:t>
+        <w:t xml:space="preserve"> simgeyle yazılır (0–9, A–F); web renkleri #FF0000 gibi yazılır: ilk çift kırmızı, ikinci çift yeşil, üçüncü çift mavi ışığın miktarıdır.</w:t>
       </w:r>
     </w:p>
     <w:p>
@@ -26002,7 +26140,7 @@
                 <w:sz w:val="20"/>
                 <w:szCs w:val="20"/>
               </w:rPr>
-              <w:t xml:space="preserve">Bir işarete önceden verilmiş, üzerinde anlaşılmış anlam.</w:t>
+              <w:t xml:space="preserve">İşaretlerle anlamları eşleştiren, önceden yapılmış anlaşma.</w:t>
             </w:r>
           </w:p>
         </w:tc>
@@ -26142,7 +26280,7 @@
                 <w:sz w:val="20"/>
                 <w:szCs w:val="20"/>
               </w:rPr>
-              <w:t xml:space="preserve">Elektriğin bir teli ne kadar güçlü “ittiğini” ölçen birim.</w:t>
+              <w:t xml:space="preserve">Bir teldeki elektriğin ne kadar güçlü “ittiğini” ölçen birim.</w:t>
             </w:r>
           </w:p>
         </w:tc>
@@ -26562,7 +26700,7 @@
                 <w:sz w:val="20"/>
                 <w:szCs w:val="20"/>
               </w:rPr>
-              <w:t xml:space="preserve">1963’te hazırlanan, 128 karakterlik ilk yaygın karakter kodlaması.</w:t>
+              <w:t xml:space="preserve">1963’te hazırlanan, 128 karakterlik, bilgisayarlarda yaygınlaşan ilk standart karakter kodlaması.</w:t>
             </w:r>
           </w:p>
         </w:tc>
@@ -27077,7 +27215,7 @@
           <w:sz w:val="22"/>
           <w:szCs w:val="22"/>
         </w:rPr>
-        <w:t xml:space="preserve">BÖLÜM SONU</w:t>
+        <w:t xml:space="preserve">KISIM SONU</w:t>
       </w:r>
     </w:p>
     <w:p>
@@ -27086,7 +27224,7 @@
         <w:spacing w:after="160"/>
       </w:pPr>
       <w:r>
-        <w:t xml:space="preserve">Kendini Değerlendir</w:t>
+        <w:t xml:space="preserve">Kendinizi Değerlendirin</w:t>
       </w:r>
     </w:p>
     <w:p>
@@ -27115,6 +27253,7 @@
     </w:p>
     <w:p>
       <w:pPr>
+        <w:keepNext/>
         <w:spacing w:after="30" w:before="0" w:line="300"/>
         <w:ind w:left="900"/>
         <w:jc w:val="left"/>
@@ -27125,6 +27264,7 @@
     </w:p>
     <w:p>
       <w:pPr>
+        <w:keepNext/>
         <w:spacing w:after="30" w:before="0" w:line="300"/>
         <w:ind w:left="900"/>
         <w:jc w:val="left"/>
@@ -27135,6 +27275,7 @@
     </w:p>
     <w:p>
       <w:pPr>
+        <w:keepNext/>
         <w:spacing w:after="30" w:before="0" w:line="300"/>
         <w:ind w:left="900"/>
         <w:jc w:val="left"/>
@@ -27145,6 +27286,7 @@
     </w:p>
     <w:p>
       <w:pPr>
+        <w:keepNext w:val="false"/>
         <w:spacing w:after="30" w:before="0" w:line="300"/>
         <w:ind w:left="900"/>
         <w:jc w:val="left"/>
@@ -27169,6 +27311,7 @@
     </w:p>
     <w:p>
       <w:pPr>
+        <w:keepNext/>
         <w:spacing w:after="30" w:before="0" w:line="300"/>
         <w:ind w:left="900"/>
         <w:jc w:val="left"/>
@@ -27179,6 +27322,7 @@
     </w:p>
     <w:p>
       <w:pPr>
+        <w:keepNext/>
         <w:spacing w:after="30" w:before="0" w:line="300"/>
         <w:ind w:left="900"/>
         <w:jc w:val="left"/>
@@ -27189,6 +27333,7 @@
     </w:p>
     <w:p>
       <w:pPr>
+        <w:keepNext/>
         <w:spacing w:after="30" w:before="0" w:line="300"/>
         <w:ind w:left="900"/>
         <w:jc w:val="left"/>
@@ -27199,6 +27344,7 @@
     </w:p>
     <w:p>
       <w:pPr>
+        <w:keepNext w:val="false"/>
         <w:spacing w:after="30" w:before="0" w:line="300"/>
         <w:ind w:left="900"/>
         <w:jc w:val="left"/>
@@ -27230,6 +27376,7 @@
     </w:p>
     <w:p>
       <w:pPr>
+        <w:keepNext/>
         <w:spacing w:after="30" w:before="0" w:line="300"/>
         <w:ind w:left="900"/>
         <w:jc w:val="left"/>
@@ -27240,6 +27387,7 @@
     </w:p>
     <w:p>
       <w:pPr>
+        <w:keepNext/>
         <w:spacing w:after="30" w:before="0" w:line="300"/>
         <w:ind w:left="900"/>
         <w:jc w:val="left"/>
@@ -27250,6 +27398,7 @@
     </w:p>
     <w:p>
       <w:pPr>
+        <w:keepNext/>
         <w:spacing w:after="30" w:before="0" w:line="300"/>
         <w:ind w:left="900"/>
         <w:jc w:val="left"/>
@@ -27260,6 +27409,7 @@
     </w:p>
     <w:p>
       <w:pPr>
+        <w:keepNext w:val="false"/>
         <w:spacing w:after="30" w:before="0" w:line="300"/>
         <w:ind w:left="900"/>
         <w:jc w:val="left"/>
@@ -27284,6 +27434,7 @@
     </w:p>
     <w:p>
       <w:pPr>
+        <w:keepNext/>
         <w:spacing w:after="30" w:before="0" w:line="300"/>
         <w:ind w:left="900"/>
         <w:jc w:val="left"/>
@@ -27294,32 +27445,35 @@
     </w:p>
     <w:p>
       <w:pPr>
+        <w:keepNext/>
         <w:spacing w:after="30" w:before="0" w:line="300"/>
         <w:ind w:left="900"/>
         <w:jc w:val="left"/>
       </w:pPr>
       <w:r>
-        <w:t xml:space="preserve">b) 8 bit, 255</w:t>
-      </w:r>
-    </w:p>
-    <w:p>
-      <w:pPr>
+        <w:t xml:space="preserve">b) 8 bit, 256</w:t>
+      </w:r>
+    </w:p>
+    <w:p>
+      <w:pPr>
+        <w:keepNext/>
         <w:spacing w:after="30" w:before="0" w:line="300"/>
         <w:ind w:left="900"/>
         <w:jc w:val="left"/>
       </w:pPr>
       <w:r>
-        <w:t xml:space="preserve">c) 8 bit, 256</w:t>
-      </w:r>
-    </w:p>
-    <w:p>
-      <w:pPr>
+        <w:t xml:space="preserve">c) 16 bit, 255</w:t>
+      </w:r>
+    </w:p>
+    <w:p>
+      <w:pPr>
+        <w:keepNext w:val="false"/>
         <w:spacing w:after="30" w:before="0" w:line="300"/>
         <w:ind w:left="900"/>
         <w:jc w:val="left"/>
       </w:pPr>
       <w:r>
-        <w:t xml:space="preserve">d) 16 bit, 255</w:t>
+        <w:t xml:space="preserve">d) 8 bit, 255</w:t>
       </w:r>
     </w:p>
     <w:p>
@@ -27338,6 +27492,7 @@
     </w:p>
     <w:p>
       <w:pPr>
+        <w:keepNext/>
         <w:spacing w:after="30" w:before="0" w:line="300"/>
         <w:ind w:left="900"/>
         <w:jc w:val="left"/>
@@ -27348,6 +27503,7 @@
     </w:p>
     <w:p>
       <w:pPr>
+        <w:keepNext/>
         <w:spacing w:after="30" w:before="0" w:line="300"/>
         <w:ind w:left="900"/>
         <w:jc w:val="left"/>
@@ -27358,6 +27514,7 @@
     </w:p>
     <w:p>
       <w:pPr>
+        <w:keepNext/>
         <w:spacing w:after="30" w:before="0" w:line="300"/>
         <w:ind w:left="900"/>
         <w:jc w:val="left"/>
@@ -27368,6 +27525,7 @@
     </w:p>
     <w:p>
       <w:pPr>
+        <w:keepNext w:val="false"/>
         <w:spacing w:after="30" w:before="0" w:line="300"/>
         <w:ind w:left="900"/>
         <w:jc w:val="left"/>
@@ -27392,6 +27550,7 @@
     </w:p>
     <w:p>
       <w:pPr>
+        <w:keepNext/>
         <w:spacing w:after="30" w:before="0" w:line="300"/>
         <w:ind w:left="900"/>
         <w:jc w:val="left"/>
@@ -27402,6 +27561,7 @@
     </w:p>
     <w:p>
       <w:pPr>
+        <w:keepNext/>
         <w:spacing w:after="30" w:before="0" w:line="300"/>
         <w:ind w:left="900"/>
         <w:jc w:val="left"/>
@@ -27412,6 +27572,7 @@
     </w:p>
     <w:p>
       <w:pPr>
+        <w:keepNext/>
         <w:spacing w:after="30" w:before="0" w:line="300"/>
         <w:ind w:left="900"/>
         <w:jc w:val="left"/>
@@ -27422,6 +27583,7 @@
     </w:p>
     <w:p>
       <w:pPr>
+        <w:keepNext w:val="false"/>
         <w:spacing w:after="30" w:before="0" w:line="300"/>
         <w:ind w:left="900"/>
         <w:jc w:val="left"/>
@@ -27446,6 +27608,7 @@
     </w:p>
     <w:p>
       <w:pPr>
+        <w:keepNext/>
         <w:spacing w:after="30" w:before="0" w:line="300"/>
         <w:ind w:left="900"/>
         <w:jc w:val="left"/>
@@ -27456,32 +27619,35 @@
     </w:p>
     <w:p>
       <w:pPr>
+        <w:keepNext/>
         <w:spacing w:after="30" w:before="0" w:line="300"/>
         <w:ind w:left="900"/>
         <w:jc w:val="left"/>
       </w:pPr>
       <w:r>
-        <w:t xml:space="preserve">b) Yeşil</w:t>
-      </w:r>
-    </w:p>
-    <w:p>
-      <w:pPr>
+        <w:t xml:space="preserve">b) Mavi</w:t>
+      </w:r>
+    </w:p>
+    <w:p>
+      <w:pPr>
+        <w:keepNext/>
         <w:spacing w:after="30" w:before="0" w:line="300"/>
         <w:ind w:left="900"/>
         <w:jc w:val="left"/>
       </w:pPr>
       <w:r>
-        <w:t xml:space="preserve">c) Mavi</w:t>
-      </w:r>
-    </w:p>
-    <w:p>
-      <w:pPr>
+        <w:t xml:space="preserve">c) Beyaz</w:t>
+      </w:r>
+    </w:p>
+    <w:p>
+      <w:pPr>
+        <w:keepNext w:val="false"/>
         <w:spacing w:after="30" w:before="0" w:line="300"/>
         <w:ind w:left="900"/>
         <w:jc w:val="left"/>
       </w:pPr>
       <w:r>
-        <w:t xml:space="preserve">d) Beyaz</w:t>
+        <w:t xml:space="preserve">d) Yeşil</w:t>
       </w:r>
     </w:p>
     <w:p>
@@ -27510,26 +27676,29 @@
     </w:p>
     <w:p>
       <w:pPr>
+        <w:keepNext/>
         <w:spacing w:after="30" w:before="0" w:line="300"/>
         <w:ind w:left="900"/>
         <w:jc w:val="left"/>
       </w:pPr>
       <w:r>
-        <w:t xml:space="preserve">a) 1</w:t>
-      </w:r>
-    </w:p>
-    <w:p>
-      <w:pPr>
+        <w:t xml:space="preserve">a) 10</w:t>
+      </w:r>
+    </w:p>
+    <w:p>
+      <w:pPr>
+        <w:keepNext/>
         <w:spacing w:after="30" w:before="0" w:line="300"/>
         <w:ind w:left="900"/>
         <w:jc w:val="left"/>
       </w:pPr>
       <w:r>
-        <w:t xml:space="preserve">b) 10</w:t>
-      </w:r>
-    </w:p>
-    <w:p>
-      <w:pPr>
+        <w:t xml:space="preserve">b) 1</w:t>
+      </w:r>
+    </w:p>
+    <w:p>
+      <w:pPr>
+        <w:keepNext/>
         <w:spacing w:after="30" w:before="0" w:line="300"/>
         <w:ind w:left="900"/>
         <w:jc w:val="left"/>
@@ -27540,6 +27709,7 @@
     </w:p>
     <w:p>
       <w:pPr>
+        <w:keepNext w:val="false"/>
         <w:spacing w:after="30" w:before="0" w:line="300"/>
         <w:ind w:left="900"/>
         <w:jc w:val="left"/>
@@ -27564,6 +27734,7 @@
     </w:p>
     <w:p>
       <w:pPr>
+        <w:keepNext/>
         <w:spacing w:after="30" w:before="0" w:line="300"/>
         <w:ind w:left="900"/>
         <w:jc w:val="left"/>
@@ -27574,6 +27745,7 @@
     </w:p>
     <w:p>
       <w:pPr>
+        <w:keepNext/>
         <w:spacing w:after="30" w:before="0" w:line="300"/>
         <w:ind w:left="900"/>
         <w:jc w:val="left"/>
@@ -27584,6 +27756,7 @@
     </w:p>
     <w:p>
       <w:pPr>
+        <w:keepNext/>
         <w:spacing w:after="30" w:before="0" w:line="300"/>
         <w:ind w:left="900"/>
         <w:jc w:val="left"/>
@@ -27594,6 +27767,7 @@
     </w:p>
     <w:p>
       <w:pPr>
+        <w:keepNext w:val="false"/>
         <w:spacing w:after="30" w:before="0" w:line="300"/>
         <w:ind w:left="900"/>
         <w:jc w:val="left"/>
@@ -27618,6 +27792,7 @@
     </w:p>
     <w:p>
       <w:pPr>
+        <w:keepNext/>
         <w:spacing w:after="30" w:before="0" w:line="300"/>
         <w:ind w:left="900"/>
         <w:jc w:val="left"/>
@@ -27628,6 +27803,7 @@
     </w:p>
     <w:p>
       <w:pPr>
+        <w:keepNext/>
         <w:spacing w:after="30" w:before="0" w:line="300"/>
         <w:ind w:left="900"/>
         <w:jc w:val="left"/>
@@ -27638,6 +27814,7 @@
     </w:p>
     <w:p>
       <w:pPr>
+        <w:keepNext/>
         <w:spacing w:after="30" w:before="0" w:line="300"/>
         <w:ind w:left="900"/>
         <w:jc w:val="left"/>
@@ -27648,6 +27825,7 @@
     </w:p>
     <w:p>
       <w:pPr>
+        <w:keepNext w:val="false"/>
         <w:spacing w:after="30" w:before="0" w:line="300"/>
         <w:ind w:left="900"/>
         <w:jc w:val="left"/>
@@ -27882,7 +28060,7 @@
         <w:spacing w:after="160"/>
       </w:pPr>
       <w:r>
-        <w:t xml:space="preserve">Kendi Kodlamanı Yarat</w:t>
+        <w:t xml:space="preserve">Kendi Kodlamanızı Yaratın</w:t>
       </w:r>
     </w:p>
     <w:p>
@@ -27891,7 +28069,7 @@
         <w:jc w:val="both"/>
       </w:pPr>
       <w:r>
-        <w:t xml:space="preserve">Bu bölümde öğrendiğiniz her şeyi birleştirme zamanı: Türkçe için </w:t>
+        <w:t xml:space="preserve">Bu kısımda öğrendiğiniz her şeyi birleştirme zamanı: Türkçe için </w:t>
       </w:r>
       <w:r>
         <w:rPr>
@@ -27968,7 +28146,7 @@
         <w:t xml:space="preserve">00001</w:t>
       </w:r>
       <w:r>
-        <w:t xml:space="preserve">). Artan kodları boşluk ve iki noktalama işaretine ayırın.</w:t>
+        <w:t xml:space="preserve">). Geriye kalan kodları boşluğa ve iki noktalama işaretine (. ve ?) verin.</w:t>
       </w:r>
     </w:p>
     <w:tbl>
@@ -30203,7 +30381,7 @@
         <w:spacing w:after="80" w:line="290"/>
       </w:pPr>
       <w:r>
-        <w:t xml:space="preserve">Kodunuzla bir arkadaşınıza kısa bir mesaj yazın; o da sizin kod tablonuzu kullanarak çözsün.</w:t>
+        <w:t xml:space="preserve">Kodunuzla bir arkadaşınıza kısa bir mesaj yazın. Arkadaşınız önce tablonuzu görmeden çözmeyi denesin; sonra tabloyu verin ve yeniden denesin.</w:t>
       </w:r>
     </w:p>
     <w:p>
@@ -30244,7 +30422,7 @@
         <w:spacing w:after="80" w:line="290"/>
       </w:pPr>
       <w:r>
-        <w:t xml:space="preserve">Arkadaşınız kod tablonuzu görmeden mesajı çözebilir mi? Bu durum, Ünite 1’deki “anlam anlaşmadan gelir” fikriyle ve Ünite 8’deki bozuk Türkçe harflerle nasıl ilişkili?</w:t>
+        <w:t xml:space="preserve">Arkadaşınız tablonuzu görmeden mesajı çözebildi mi? Bu durum, Ünite 1’deki “anlam anlaşmadan gelir” fikriyle ve Ünite 8’deki bozuk Türkçe harflerle nasıl ilişkili?</w:t>
       </w:r>
     </w:p>
     <w:p>
@@ -30525,7 +30703,7 @@
         <w:jc w:val="both"/>
       </w:pPr>
       <w:r>
-        <w:t xml:space="preserve">3 → 8, 4 → 16, 5 → 32, 6 → 64, 7 → 128, 8 → 256;  16 → 65.536, 20 → 1.048.576, 24 → 16.777.216, 32 → 4.294.967.296, 40 → 1.099.511.627.776 (bir trilyondan fazla).</w:t>
+        <w:t xml:space="preserve">3 → 8, 4 → 16, 5 → 32, 6 → 64, 7 → 128, 8 → 256;  10 → 1.024, 16 → 65.536, 20 → 1.048.576, 24 → 16.777.216, 32 → 4.294.967.296, 40 → 1.099.511.627.776 (bir trilyondan fazla).</w:t>
       </w:r>
     </w:p>
     <w:p>
@@ -31197,7 +31375,7 @@
         <w:jc w:val="both"/>
       </w:pPr>
       <w:r>
-        <w:t xml:space="preserve">a) En yüksek: 2. sıra (222); en düşük: 7. sıra (46).  b) Dalga kabalaşır, ince dalgalanmalar kaybolur. Saniyede daha az ölçüm yapan bir cihaz, özellikle tiz (hızlı titreşen) sesleri doğru kaydedemez.</w:t>
+        <w:t xml:space="preserve">a) En yüksek: sıra numarası 2 (222, üçüncü ölçüm); en düşük: sıra numarası 7 (46, sekizinci ölçüm).  b) Dalganın genel biçimi korunur ama köşeli olur; en düşük ölçüm (sıra 7, 46) atlanır ve dip 62 gibi görünür. Ölçümler seyrekleşince aradaki hızlı değişimler yakalanamaz; bu yüzden saniyede daha az ölçüm yapan bir cihaz, özellikle tiz (hızlı titreşen) sesleri doğru kaydedemez.</w:t>
       </w:r>
     </w:p>
     <w:p>
@@ -31207,7 +31385,7 @@
         <w:spacing w:after="80" w:before="160"/>
       </w:pPr>
       <w:r>
-        <w:t xml:space="preserve">Kendini Değerlendir</w:t>
+        <w:t xml:space="preserve">Kendinizi Değerlendirin</w:t>
       </w:r>
     </w:p>
     <w:p>
@@ -31216,7 +31394,7 @@
         <w:jc w:val="both"/>
       </w:pPr>
       <w:r>
-        <w:t xml:space="preserve">1-b, 2-c, 3-a, 4-b, 5-c, 6-b, 7-b, 8-b, 9-c, 10-a.  12) 45 = 32 + 8 + 4 + 1 = </w:t>
+        <w:t xml:space="preserve">1-b, 2-c, 3-a, 4-d, 5-c, 6-b, 7-d, 8-a, 9-c, 10-a.  12) 45 = 32 + 8 + 4 + 1 = </w:t>
       </w:r>
       <w:r>
         <w:rPr>
@@ -31285,7 +31463,7 @@
         <w:t xml:space="preserve">5 bit</w:t>
       </w:r>
       <w:r>
-        <w:t xml:space="preserve">. 4) Tablo olmadan çözülemez; anlam, anlaşmadan gelir. 5) 29 büyük + 29 küçük + 10 rakam = 68 &gt; 64 olduğundan </w:t>
+        <w:t xml:space="preserve">. 4) Tablo olmadan çözmek neredeyse imkânsızdır; anlam, anlaşmadan gelir. 5) 29 büyük + 29 küçük + 10 rakam = 68 &gt; 64 olduğundan </w:t>
       </w:r>
       <w:r>
         <w:rPr>
@@ -31327,10 +31505,10 @@
           <w:b/>
           <w:bCs/>
         </w:rPr>
-        <w:t xml:space="preserve">Önerilen akış (2 ders saati):</w:t>
-      </w:r>
-      <w:r>
-        <w:t xml:space="preserve"> 1. ders — video (9 dk), Ünite 1–5 ve Etkinlik 1, 3, 7. 2. ders — Ünite 6–11, Etkinlik 11, 13, 15, 16 ve grup tartışması.</w:t>
+        <w:t xml:space="preserve">Önerilen akış (4 ders saati):</w:t>
+      </w:r>
+      <w:r>
+        <w:t xml:space="preserve"> 1. ders — video (9 dk), Ünite 1–2, Etkinlik 1, 2, 3. 2. ders — Ünite 3–5, Etkinlik 4, 5, 7. 3. ders — Ünite 6–8, Etkinlik 9, 11, 13. 4. ders — Ünite 9–11, Etkinlik 15, 16 ve grup tartışması. Zaman darsa Etkinlik 6, 8, 14 ve 17 ödev verilebilir.</w:t>
       </w:r>
     </w:p>
     <w:p>
@@ -31370,6 +31548,112 @@
       </w:pPr>
       <w:r>
         <w:t xml:space="preserve">Ünite 11’deki tartışmada tek doğru cevap aranmamalıdır; amaç, öğrencilerin veri toplama konusunda soru sormayı alışkanlık hâline getirmesidir.</w:t>
+      </w:r>
+    </w:p>
+    <w:p>
+      <w:r>
+        <w:br w:type="page"/>
+      </w:r>
+    </w:p>
+    <w:p>
+      <w:pPr>
+        <w:spacing w:after="40"/>
+      </w:pPr>
+      <w:r>
+        <w:rPr>
+          <w:b/>
+          <w:bCs/>
+          <w:color w:val="E8541A"/>
+          <w:spacing w:val="60"/>
+          <w:sz w:val="22"/>
+          <w:szCs w:val="22"/>
+        </w:rPr>
+        <w:t xml:space="preserve">EK</w:t>
+      </w:r>
+    </w:p>
+    <w:p>
+      <w:pPr>
+        <w:pStyle w:val="Heading1"/>
+        <w:spacing w:after="160"/>
+      </w:pPr>
+      <w:r>
+        <w:t xml:space="preserve">Kesme Sayfası: Bit Kartları</w:t>
+      </w:r>
+    </w:p>
+    <w:p>
+      <w:pPr>
+        <w:spacing w:after="100" w:before="0" w:line="300"/>
+        <w:jc w:val="both"/>
+      </w:pPr>
+      <w:r>
+        <w:t xml:space="preserve">Bu sayfanın fotokopisini çekin ya da sayfayı dikkatlice kitaptan ayırın. Kartları kesik çizgilerden kesin; sağlam olsun isterseniz bir kartona yapıştırın. Kartın </w:t>
+      </w:r>
+      <w:r>
+        <w:rPr>
+          <w:b/>
+          <w:bCs/>
+        </w:rPr>
+        <w:t xml:space="preserve">noktalı yüzü 1</w:t>
+      </w:r>
+      <w:r>
+        <w:t xml:space="preserve">, </w:t>
+      </w:r>
+      <w:r>
+        <w:rPr>
+          <w:b/>
+          <w:bCs/>
+        </w:rPr>
+        <w:t xml:space="preserve">boş arka yüzü 0</w:t>
+      </w:r>
+      <w:r>
+        <w:t xml:space="preserve"> demektir.</w:t>
+      </w:r>
+    </w:p>
+    <w:p>
+      <w:pPr>
+        <w:keepNext w:val="false"/>
+        <w:spacing w:after="160" w:before="80"/>
+        <w:jc w:val="center"/>
+      </w:pPr>
+      <w:r>
+        <w:drawing>
+          <wp:inline distT="0" distB="0" distL="0" distR="0">
+            <wp:extent cx="5038725" cy="6257925"/>
+            <wp:effectExtent t="0" r="0" b="0" l="0"/>
+            <wp:docPr id="1" name="kesme_kartlari.png" descr="kesme_kartlari.png" title="kesme_kartlari.png"/>
+            <wp:cNvGraphicFramePr>
+              <a:graphicFrameLocks xmlns:a="http://schemas.openxmlformats.org/drawingml/2006/main" noChangeAspect="1"/>
+            </wp:cNvGraphicFramePr>
+            <a:graphic xmlns:a="http://schemas.openxmlformats.org/drawingml/2006/main">
+              <a:graphicData uri="http://schemas.openxmlformats.org/drawingml/2006/picture">
+                <pic:pic xmlns:pic="http://schemas.openxmlformats.org/drawingml/2006/picture">
+                  <pic:nvPicPr>
+                    <pic:cNvPr id="0" name="" descr=""/>
+                    <pic:cNvPicPr>
+                      <a:picLocks noChangeAspect="1" noChangeArrowheads="1"/>
+                    </pic:cNvPicPr>
+                  </pic:nvPicPr>
+                  <pic:blipFill>
+                    <a:blip r:embed="rId39" cstate="none"/>
+                    <a:srcRect/>
+                    <a:stretch>
+                      <a:fillRect/>
+                    </a:stretch>
+                  </pic:blipFill>
+                  <pic:spPr bwMode="auto">
+                    <a:xfrm>
+                      <a:off x="0" y="0"/>
+                      <a:ext cx="5038725" cy="6257925"/>
+                    </a:xfrm>
+                    <a:prstGeom prst="rect">
+                      <a:avLst/>
+                    </a:prstGeom>
+                  </pic:spPr>
+                </pic:pic>
+              </a:graphicData>
+            </a:graphic>
+          </wp:inline>
+        </w:drawing>
       </w:r>
     </w:p>
     <w:sectPr>

</xml_diff>